<commit_message>
Atualiza templates, HTML, arquivos estáticos e requirements
</commit_message>
<xml_diff>
--- a/app/docx_templates/ADITIVO.docx
+++ b/app/docx_templates/ADITIVO.docx
@@ -3282,9 +3282,6 @@
       <w:pPr>
         <w:pStyle w:val="Corpodetexto"/>
         <w:spacing w:before="3"/>
-        <w:rPr>
-          <w:u w:val="single"/>
-        </w:rPr>
       </w:pPr>
     </w:p>
     <w:p>
@@ -3296,6 +3293,9 @@
         <w:spacing w:before="1"/>
         <w:ind w:left="-1" w:right="138"/>
         <w:jc w:val="center"/>
+        <w:rPr>
+          <w:u w:val="single"/>
+        </w:rPr>
       </w:pPr>
       <w:r>
         <w:t>Caldas</w:t>
@@ -3313,54 +3313,36 @@
         <w:t>Novas/GO,</w:t>
       </w:r>
       <w:r>
-        <w:t xml:space="preserve"> </w:t>
-      </w:r>
-      <w:r>
-        <w:t xml:space="preserve">   </w:t>
-      </w:r>
-      <w:r>
-        <w:t>DE</w:t>
-      </w:r>
-      <w:r>
-        <w:rPr>
-          <w:spacing w:val="-17"/>
-        </w:rPr>
-        <w:t xml:space="preserve"> </w:t>
-      </w:r>
-      <w:r>
-        <w:t>{{</w:t>
-      </w:r>
-      <w:r>
-        <w:t>mes_id</w:t>
-      </w:r>
-      <w:r>
-        <w:t>}}</w:t>
-      </w:r>
-      <w:r>
-        <w:rPr>
-          <w:spacing w:val="18"/>
-        </w:rPr>
-        <w:t xml:space="preserve"> </w:t>
-      </w:r>
-      <w:r>
-        <w:t>de</w:t>
-      </w:r>
-      <w:r>
-        <w:rPr>
-          <w:spacing w:val="-15"/>
-        </w:rPr>
-        <w:t xml:space="preserve"> </w:t>
+        <w:rPr>
+          <w:spacing w:val="-2"/>
+        </w:rPr>
+        <w:t xml:space="preserve"> {{date</w:t>
+      </w:r>
+      <w:r>
+        <w:rPr>
+          <w:spacing w:val="-2"/>
+        </w:rPr>
+        <w:t>today</w:t>
+      </w:r>
+      <w:r>
+        <w:rPr>
+          <w:spacing w:val="-2"/>
+        </w:rPr>
+        <w:t>_id}}</w:t>
       </w:r>
       <w:r>
         <w:rPr>
           <w:spacing w:val="-4"/>
         </w:rPr>
-        <w:t>2025.</w:t>
+        <w:t>.</w:t>
       </w:r>
     </w:p>
     <w:p>
       <w:pPr>
         <w:pStyle w:val="Corpodetexto"/>
+        <w:rPr>
+          <w:u w:val="single"/>
+        </w:rPr>
       </w:pPr>
     </w:p>
     <w:p>
@@ -3371,6 +3353,9 @@
     <w:p>
       <w:pPr>
         <w:pStyle w:val="Corpodetexto"/>
+        <w:rPr>
+          <w:u w:val="single"/>
+        </w:rPr>
       </w:pPr>
     </w:p>
     <w:p>
@@ -3590,7 +3575,7 @@
           </mc:Choice>
           <mc:Fallback>
             <w:pict>
-              <v:shape w14:anchorId="4569D144" id="Graphic 2" o:spid="_x0000_s1026" style="position:absolute;margin-left:91.1pt;margin-top:13.45pt;width:202.6pt;height:.1pt;z-index:-15728640;visibility:visible;mso-wrap-style:square;mso-wrap-distance-left:0;mso-wrap-distance-top:0;mso-wrap-distance-right:0;mso-wrap-distance-bottom:0;mso-position-horizontal:absolute;mso-position-horizontal-relative:page;mso-position-vertical:absolute;mso-position-vertical-relative:text;v-text-anchor:top" coordsize="2573020,1270" o:gfxdata="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" path="m,l2573000,e" filled="f" strokeweight=".45pt">
+              <v:shape w14:anchorId="6A7CEE82" id="Graphic 2" o:spid="_x0000_s1026" style="position:absolute;margin-left:91.1pt;margin-top:13.45pt;width:202.6pt;height:.1pt;z-index:-15728640;visibility:visible;mso-wrap-style:square;mso-wrap-distance-left:0;mso-wrap-distance-top:0;mso-wrap-distance-right:0;mso-wrap-distance-bottom:0;mso-position-horizontal:absolute;mso-position-horizontal-relative:page;mso-position-vertical:absolute;mso-position-vertical-relative:text;v-text-anchor:top" coordsize="2573020,1270" o:gfxdata="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" path="m,l2573000,e" filled="f" strokeweight=".45pt">
                 <v:path arrowok="t"/>
                 <w10:wrap type="topAndBottom" anchorx="page"/>
               </v:shape>
@@ -3670,7 +3655,7 @@
           </mc:Choice>
           <mc:Fallback>
             <w:pict>
-              <v:shape w14:anchorId="75498CF3" id="Graphic 3" o:spid="_x0000_s1026" style="position:absolute;margin-left:308.8pt;margin-top:13.45pt;width:202.6pt;height:.1pt;z-index:-15728128;visibility:visible;mso-wrap-style:square;mso-wrap-distance-left:0;mso-wrap-distance-top:0;mso-wrap-distance-right:0;mso-wrap-distance-bottom:0;mso-position-horizontal:absolute;mso-position-horizontal-relative:page;mso-position-vertical:absolute;mso-position-vertical-relative:text;v-text-anchor:top" coordsize="2573020,1270" o:gfxdata="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" path="m,l2573000,e" filled="f" strokeweight=".45pt">
+              <v:shape w14:anchorId="3648DA37" id="Graphic 3" o:spid="_x0000_s1026" style="position:absolute;margin-left:308.8pt;margin-top:13.45pt;width:202.6pt;height:.1pt;z-index:-15728128;visibility:visible;mso-wrap-style:square;mso-wrap-distance-left:0;mso-wrap-distance-top:0;mso-wrap-distance-right:0;mso-wrap-distance-bottom:0;mso-position-horizontal:absolute;mso-position-horizontal-relative:page;mso-position-vertical:absolute;mso-position-vertical-relative:text;v-text-anchor:top" coordsize="2573020,1270" o:gfxdata="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" path="m,l2573000,e" filled="f" strokeweight=".45pt">
                 <v:path arrowok="t"/>
                 <w10:wrap type="topAndBottom" anchorx="page"/>
               </v:shape>

</xml_diff>